<commit_message>
Part 3 drafted; Times New Roman; figure layout audit; linked footnotes
- Part 3 (enabling foundations): energy, solar irrigation, land, standards
  and certification, trade and customs, with six figures and Box 3.1.
- Model: park PV sized from line-level electricity demand; solar cost
  components; irrigation anchored on Afgoye evidence; new M-claims.
- Figures: Times New Roman 11 pt and an automatic layout audit (with tests)
  that rejects hidden, clashing or low-contrast text.
- Build: every citation a numbered footnote with a link to the source page;
  figure source lines footnoted; Times New Roman body text.
- New sources S-163, S-164; claims C-0530 to C-0544, D-0080, all passed by
  the independent fact-checker after corrections.

Co-Authored-By: Claude Opus 5.5 <noreply@anthropic.com>
</commit_message>
<xml_diff>
--- a/report/template/reference.docx
+++ b/report/template/reference.docx
@@ -485,9 +485,9 @@
   <w:docDefaults>
     <w:rPrDefault>
       <w:rPr>
-        <w:rFonts w:ascii="Arial" w:hAnsi="Arial" w:cs="Arial" w:eastAsia="Arial"/>
-        <w:sz w:val="21"/>
-        <w:szCs w:val="21"/>
+        <w:rFonts w:ascii="Times New Roman" w:hAnsi="Times New Roman" w:cs="Times New Roman" w:eastAsia="Times New Roman"/>
+        <w:sz w:val="24"/>
+        <w:szCs w:val="24"/>
       </w:rPr>
     </w:rPrDefault>
     <w:pPrDefault>
@@ -511,9 +511,9 @@
       <w:jc w:val="both"/>
     </w:pPr>
     <w:rPr>
-      <w:rFonts w:ascii="Arial" w:hAnsi="Arial" w:cs="Arial" w:eastAsia="Arial"/>
-      <w:sz w:val="21"/>
-      <w:szCs w:val="21"/>
+      <w:rFonts w:ascii="Times New Roman" w:hAnsi="Times New Roman" w:cs="Times New Roman" w:eastAsia="Times New Roman"/>
+      <w:sz w:val="24"/>
+      <w:szCs w:val="24"/>
     </w:rPr>
   </w:style>
   <w:style w:type="paragraph" w:customStyle="1" w:styleId="FirstParagraph">
@@ -526,9 +526,9 @@
       <w:jc w:val="both"/>
     </w:pPr>
     <w:rPr>
-      <w:rFonts w:ascii="Arial" w:hAnsi="Arial" w:cs="Arial" w:eastAsia="Arial"/>
-      <w:sz w:val="21"/>
-      <w:szCs w:val="21"/>
+      <w:rFonts w:ascii="Times New Roman" w:hAnsi="Times New Roman" w:cs="Times New Roman" w:eastAsia="Times New Roman"/>
+      <w:sz w:val="24"/>
+      <w:szCs w:val="24"/>
     </w:rPr>
   </w:style>
   <w:style w:type="paragraph" w:customStyle="1" w:styleId="Compact">
@@ -539,9 +539,9 @@
       <w:spacing w:before="0" w:after="60"/>
     </w:pPr>
     <w:rPr>
-      <w:rFonts w:ascii="Arial" w:hAnsi="Arial" w:cs="Arial" w:eastAsia="Arial"/>
-      <w:sz w:val="21"/>
-      <w:szCs w:val="21"/>
+      <w:rFonts w:ascii="Times New Roman" w:hAnsi="Times New Roman" w:cs="Times New Roman" w:eastAsia="Times New Roman"/>
+      <w:sz w:val="24"/>
+      <w:szCs w:val="24"/>
     </w:rPr>
   </w:style>
   <w:style w:type="paragraph" w:styleId="Title">
@@ -556,7 +556,7 @@
       <w:spacing w:before="2400" w:after="240"/>
     </w:pPr>
     <w:rPr>
-      <w:rFonts w:ascii="Arial" w:hAnsi="Arial" w:cs="Arial" w:eastAsia="Arial"/>
+      <w:rFonts w:ascii="Times New Roman" w:hAnsi="Times New Roman" w:cs="Times New Roman" w:eastAsia="Times New Roman"/>
       <w:b/>
       <w:bCs/>
       <w:color w:val="0B3C5D"/>
@@ -588,7 +588,7 @@
       <w:spacing w:after="240"/>
     </w:pPr>
     <w:rPr>
-      <w:rFonts w:ascii="Arial" w:hAnsi="Arial" w:cs="Arial" w:eastAsia="Arial"/>
+      <w:rFonts w:ascii="Times New Roman" w:hAnsi="Times New Roman" w:cs="Times New Roman" w:eastAsia="Times New Roman"/>
       <w:color w:val="328CC1"/>
       <w:sz w:val="26"/>
       <w:szCs w:val="26"/>
@@ -631,7 +631,7 @@
       <w:spacing w:after="240"/>
     </w:pPr>
     <w:rPr>
-      <w:rFonts w:ascii="Arial" w:hAnsi="Arial" w:cs="Arial" w:eastAsia="Arial"/>
+      <w:rFonts w:ascii="Times New Roman" w:hAnsi="Times New Roman" w:cs="Times New Roman" w:eastAsia="Times New Roman"/>
       <w:color w:val="595959"/>
       <w:sz w:val="22"/>
       <w:szCs w:val="22"/>
@@ -693,7 +693,7 @@
       <w:outlineLvl w:val="0"/>
     </w:pPr>
     <w:rPr>
-      <w:rFonts w:ascii="Arial" w:hAnsi="Arial" w:cs="Arial" w:eastAsia="Arial"/>
+      <w:rFonts w:ascii="Times New Roman" w:hAnsi="Times New Roman" w:cs="Times New Roman" w:eastAsia="Times New Roman"/>
       <w:b/>
       <w:bCs/>
       <w:color w:val="0B3C5D"/>
@@ -718,7 +718,7 @@
       <w:outlineLvl w:val="1"/>
     </w:pPr>
     <w:rPr>
-      <w:rFonts w:ascii="Arial" w:hAnsi="Arial" w:cs="Arial" w:eastAsia="Arial"/>
+      <w:rFonts w:ascii="Times New Roman" w:hAnsi="Times New Roman" w:cs="Times New Roman" w:eastAsia="Times New Roman"/>
       <w:b/>
       <w:bCs/>
       <w:color w:val="0B3C5D"/>
@@ -743,7 +743,7 @@
       <w:outlineLvl w:val="2"/>
     </w:pPr>
     <w:rPr>
-      <w:rFonts w:ascii="Arial" w:hAnsi="Arial" w:cs="Arial" w:eastAsia="Arial"/>
+      <w:rFonts w:ascii="Times New Roman" w:hAnsi="Times New Roman" w:cs="Times New Roman" w:eastAsia="Times New Roman"/>
       <w:b/>
       <w:bCs/>
       <w:color w:val="328CC1"/>
@@ -768,7 +768,7 @@
       <w:outlineLvl w:val="3"/>
     </w:pPr>
     <w:rPr>
-      <w:rFonts w:ascii="Arial" w:hAnsi="Arial" w:cs="Arial" w:eastAsia="Arial"/>
+      <w:rFonts w:ascii="Times New Roman" w:hAnsi="Times New Roman" w:cs="Times New Roman" w:eastAsia="Times New Roman"/>
       <w:b/>
       <w:bCs/>
       <w:color w:val="0B3C5D"/>
@@ -1017,25 +1017,25 @@
       <w:ind w:left="200" w:right="200"/>
     </w:pPr>
     <w:rPr>
-      <w:rFonts w:ascii="Arial" w:hAnsi="Arial" w:cs="Arial" w:eastAsia="Arial"/>
+      <w:rFonts w:ascii="Times New Roman" w:hAnsi="Times New Roman" w:cs="Times New Roman" w:eastAsia="Times New Roman"/>
+      <w:sz w:val="22"/>
+      <w:szCs w:val="22"/>
+    </w:rPr>
+  </w:style>
+  <w:style w:type="paragraph" w:styleId="FootnoteText">
+    <w:name w:val="Footnote Text"/>
+    <w:basedOn w:val="Normal"/>
+    <w:next w:val="FootnoteText"/>
+    <w:uiPriority w:val="9"/>
+    <w:unhideWhenUsed/>
+    <w:qFormat/>
+    <w:pPr>
+      <w:spacing w:after="40" w:line="220" w:lineRule="auto"/>
+    </w:pPr>
+    <w:rPr>
+      <w:rFonts w:ascii="Times New Roman" w:hAnsi="Times New Roman" w:cs="Times New Roman" w:eastAsia="Times New Roman"/>
       <w:sz w:val="20"/>
       <w:szCs w:val="20"/>
-    </w:rPr>
-  </w:style>
-  <w:style w:type="paragraph" w:styleId="FootnoteText">
-    <w:name w:val="Footnote Text"/>
-    <w:basedOn w:val="Normal"/>
-    <w:next w:val="FootnoteText"/>
-    <w:uiPriority w:val="9"/>
-    <w:unhideWhenUsed/>
-    <w:qFormat/>
-    <w:pPr>
-      <w:spacing w:after="40" w:line="220" w:lineRule="auto"/>
-    </w:pPr>
-    <w:rPr>
-      <w:rFonts w:ascii="Arial" w:hAnsi="Arial" w:cs="Arial" w:eastAsia="Arial"/>
-      <w:sz w:val="15"/>
-      <w:szCs w:val="15"/>
     </w:rPr>
   </w:style>
   <w:style w:type="paragraph" w:styleId="FootnoteBlockText">
@@ -1104,11 +1104,11 @@
       <w:spacing w:before="60" w:after="160"/>
     </w:pPr>
     <w:rPr>
-      <w:rFonts w:ascii="Arial" w:hAnsi="Arial" w:cs="Arial" w:eastAsia="Arial"/>
+      <w:rFonts w:ascii="Times New Roman" w:hAnsi="Times New Roman" w:cs="Times New Roman" w:eastAsia="Times New Roman"/>
       <w:i/>
       <w:iCs/>
-      <w:sz w:val="16"/>
-      <w:szCs w:val="16"/>
+      <w:sz w:val="20"/>
+      <w:szCs w:val="20"/>
     </w:rPr>
   </w:style>
   <w:style w:type="paragraph" w:customStyle="1" w:styleId="TableCaption">
@@ -1119,12 +1119,12 @@
       <w:spacing w:before="200" w:after="80"/>
     </w:pPr>
     <w:rPr>
-      <w:rFonts w:ascii="Arial" w:hAnsi="Arial" w:cs="Arial" w:eastAsia="Arial"/>
+      <w:rFonts w:ascii="Times New Roman" w:hAnsi="Times New Roman" w:cs="Times New Roman" w:eastAsia="Times New Roman"/>
       <w:b/>
       <w:bCs/>
       <w:color w:val="0B3C5D"/>
-      <w:sz w:val="20"/>
-      <w:szCs w:val="20"/>
+      <w:sz w:val="22"/>
+      <w:szCs w:val="22"/>
     </w:rPr>
   </w:style>
   <w:style w:type="paragraph" w:customStyle="1" w:styleId="ImageCaption">
@@ -1134,11 +1134,11 @@
       <w:spacing w:before="60" w:after="160"/>
     </w:pPr>
     <w:rPr>
-      <w:rFonts w:ascii="Arial" w:hAnsi="Arial" w:cs="Arial" w:eastAsia="Arial"/>
+      <w:rFonts w:ascii="Times New Roman" w:hAnsi="Times New Roman" w:cs="Times New Roman" w:eastAsia="Times New Roman"/>
       <w:i/>
       <w:iCs/>
-      <w:sz w:val="16"/>
-      <w:szCs w:val="16"/>
+      <w:sz w:val="20"/>
+      <w:szCs w:val="20"/>
     </w:rPr>
   </w:style>
   <w:style w:type="paragraph" w:customStyle="1" w:styleId="Figure">
@@ -1150,9 +1150,9 @@
       <w:spacing w:before="0" w:after="60"/>
     </w:pPr>
     <w:rPr>
-      <w:rFonts w:ascii="Arial" w:hAnsi="Arial" w:cs="Arial" w:eastAsia="Arial"/>
-      <w:sz w:val="21"/>
-      <w:szCs w:val="21"/>
+      <w:rFonts w:ascii="Times New Roman" w:hAnsi="Times New Roman" w:cs="Times New Roman" w:eastAsia="Times New Roman"/>
+      <w:sz w:val="24"/>
+      <w:szCs w:val="24"/>
     </w:rPr>
   </w:style>
   <w:style w:type="paragraph" w:customStyle="1" w:styleId="CaptionedFigure">
@@ -1222,12 +1222,12 @@
       <w:spacing w:before="240" w:after="80"/>
     </w:pPr>
     <w:rPr>
-      <w:rFonts w:ascii="Arial" w:hAnsi="Arial" w:cs="Arial" w:eastAsia="Arial"/>
+      <w:rFonts w:ascii="Times New Roman" w:hAnsi="Times New Roman" w:cs="Times New Roman" w:eastAsia="Times New Roman"/>
       <w:b/>
       <w:bCs/>
       <w:color w:val="0B3C5D"/>
-      <w:sz w:val="20"/>
-      <w:szCs w:val="20"/>
+      <w:sz w:val="22"/>
+      <w:szCs w:val="22"/>
     </w:rPr>
   </w:style>
 </w:styles>

</xml_diff>